<commit_message>
feat(gemini_service): implement AI query processing with Gemini model integration
- Added gemini_service.py to handle AI-generated responses based on user queries and database context.
- Integrated environment variable loading for secure API key management.
- Defined system instructions to ensure responses are based solely on provided context.
- Implemented error handling for improved user experience during query processing.
</commit_message>
<xml_diff>
--- a/docs/BackLog.docx
+++ b/docs/BackLog.docx
@@ -555,6 +555,54 @@
           <w:lang w:val="en-IL"/>
         </w:rPr>
       </w:pPr>
+      <w:r>
+        <w:rPr>
+          <w:rFonts w:hint="cs"/>
+          <w:rtl/>
+          <w:lang w:val="en-IL"/>
+        </w:rPr>
+        <w:t>יצירת מודלים</w:t>
+      </w:r>
+    </w:p>
+    <w:p>
+      <w:pPr>
+        <w:numPr>
+          <w:ilvl w:val="1"/>
+          <w:numId w:val="47"/>
+        </w:numPr>
+        <w:bidi/>
+        <w:rPr>
+          <w:lang w:val="en-IL"/>
+        </w:rPr>
+      </w:pPr>
+      <w:r>
+        <w:rPr>
+          <w:rFonts w:hint="cs"/>
+          <w:rtl/>
+          <w:lang w:val="en-IL"/>
+        </w:rPr>
+        <w:t xml:space="preserve">יצירת דאטה- רשומות </w:t>
+      </w:r>
+    </w:p>
+    <w:p>
+      <w:pPr>
+        <w:numPr>
+          <w:ilvl w:val="2"/>
+          <w:numId w:val="47"/>
+        </w:numPr>
+        <w:bidi/>
+        <w:rPr>
+          <w:lang w:val="en-IL"/>
+        </w:rPr>
+      </w:pPr>
+      <w:r>
+        <w:rPr>
+          <w:rFonts w:hint="cs"/>
+          <w:rtl/>
+          <w:lang w:val="en-IL"/>
+        </w:rPr>
+        <w:t>צמצום מפתחות</w:t>
+      </w:r>
     </w:p>
     <w:p>
       <w:pPr>
@@ -607,6 +655,7 @@
           <w:bCs/>
           <w:lang w:val="en-IL"/>
         </w:rPr>
+        <w:lastRenderedPageBreak/>
         <w:t>User Story:</w:t>
       </w:r>
       <w:r>
@@ -683,7 +732,6 @@
           <w:bCs/>
           <w:rtl/>
         </w:rPr>
-        <w:lastRenderedPageBreak/>
         <w:t>איך החלקים משתלבים</w:t>
       </w:r>
       <w:r>
@@ -5361,7 +5409,7 @@
         <w:sz w:val="20"/>
       </w:rPr>
     </w:lvl>
-    <w:lvl w:ilvl="2" w:tentative="1">
+    <w:lvl w:ilvl="2">
       <w:start w:val="1"/>
       <w:numFmt w:val="bullet"/>
       <w:lvlText w:val=""/>

</xml_diff>